<commit_message>
refactor docs: modificación y agregación
Se modificó el párrafo solicitado y se incorporaron los mapas de sitio correspondientes.
</commit_message>
<xml_diff>
--- a/Fase#2/Card Sorting/Card Sorting.docx
+++ b/Fase#2/Card Sorting/Card Sorting.docx
@@ -223,7 +223,23 @@
           <w:sz w:val="24"/>
           <w:szCs w:val="24"/>
         </w:rPr>
-        <w:t xml:space="preserve"> cerrado, ya que el sistema ya cuenta con una base de datos definida y se desea mantener una estructura de navegación preestablecida.</w:t>
+        <w:t xml:space="preserve"> cerrado, ya que </w:t>
+      </w:r>
+      <w:r>
+        <w:rPr>
+          <w:rFonts w:ascii="Arial" w:hAnsi="Arial" w:cs="Arial"/>
+          <w:sz w:val="24"/>
+          <w:szCs w:val="24"/>
+        </w:rPr>
+        <w:t xml:space="preserve">las categorías </w:t>
+      </w:r>
+      <w:r>
+        <w:rPr>
+          <w:rFonts w:ascii="Arial" w:hAnsi="Arial" w:cs="Arial"/>
+          <w:sz w:val="24"/>
+          <w:szCs w:val="24"/>
+        </w:rPr>
+        <w:t>y subcategorías de Tutorías UTDP fueron previamente definidas por el equipo de trabajo con base en la estructura del sistema y su base de datos. De esta manera, los usuarios únicamente debían clasificar las tarjetas dentro de los grupos establecidos, lo que permitió evaluar la claridad y coherencia de la organización propuesta.</w:t>
       </w:r>
     </w:p>
     <w:p>
@@ -797,6 +813,7 @@
           <w:szCs w:val="24"/>
           <w:lang w:val="en-US"/>
         </w:rPr>
+        <w:lastRenderedPageBreak/>
         <w:t>Física</w:t>
       </w:r>
       <w:proofErr w:type="spellEnd"/>
@@ -928,7 +945,6 @@
           <w:szCs w:val="24"/>
           <w:lang w:val="en-US"/>
         </w:rPr>
-        <w:lastRenderedPageBreak/>
         <w:t>Listado</w:t>
       </w:r>
       <w:proofErr w:type="spellEnd"/>
@@ -1399,6 +1415,7 @@
       <w:r>
         <w:rPr>
           <w:rFonts w:ascii="Arial" w:hAnsi="Arial" w:cs="Arial"/>
+          <w:noProof/>
           <w:sz w:val="24"/>
           <w:szCs w:val="24"/>
         </w:rPr>
@@ -1514,6 +1531,25 @@
     </w:p>
     <w:p>
       <w:pPr>
+        <w:jc w:val="both"/>
+        <w:rPr>
+          <w:rFonts w:ascii="Arial" w:hAnsi="Arial" w:cs="Arial"/>
+          <w:sz w:val="24"/>
+          <w:szCs w:val="24"/>
+        </w:rPr>
+      </w:pPr>
+      <w:r>
+        <w:rPr>
+          <w:rFonts w:ascii="Arial" w:hAnsi="Arial" w:cs="Arial"/>
+          <w:sz w:val="24"/>
+          <w:szCs w:val="24"/>
+        </w:rPr>
+        <w:lastRenderedPageBreak/>
+        <w:t>Mapa de Sitio - Usuario 1:</w:t>
+      </w:r>
+    </w:p>
+    <w:p>
+      <w:pPr>
         <w:jc w:val="center"/>
         <w:rPr>
           <w:rFonts w:ascii="Arial" w:hAnsi="Arial" w:cs="Arial"/>
@@ -1521,80 +1557,15 @@
           <w:szCs w:val="24"/>
         </w:rPr>
       </w:pPr>
-    </w:p>
-    <w:p>
-      <w:pPr>
-        <w:jc w:val="center"/>
-        <w:rPr>
-          <w:rFonts w:ascii="Arial" w:hAnsi="Arial" w:cs="Arial"/>
-          <w:sz w:val="24"/>
-          <w:szCs w:val="24"/>
-        </w:rPr>
-      </w:pPr>
-    </w:p>
-    <w:p>
-      <w:pPr>
-        <w:jc w:val="both"/>
-        <w:rPr>
-          <w:rFonts w:ascii="Arial" w:hAnsi="Arial" w:cs="Arial"/>
-          <w:sz w:val="24"/>
-          <w:szCs w:val="24"/>
-        </w:rPr>
-      </w:pPr>
-      <w:r>
-        <w:rPr>
-          <w:rFonts w:ascii="Arial" w:hAnsi="Arial" w:cs="Arial"/>
-          <w:sz w:val="24"/>
-          <w:szCs w:val="24"/>
-        </w:rPr>
-        <w:lastRenderedPageBreak/>
-        <w:t xml:space="preserve">El segundo usuario </w:t>
-      </w:r>
-      <w:r>
-        <w:rPr>
-          <w:rFonts w:ascii="Arial" w:hAnsi="Arial" w:cs="Arial"/>
-          <w:sz w:val="24"/>
-          <w:szCs w:val="24"/>
-        </w:rPr>
-        <w:t>realizo la prueba en</w:t>
-      </w:r>
-      <w:r>
-        <w:rPr>
-          <w:rFonts w:ascii="Arial" w:hAnsi="Arial" w:cs="Arial"/>
-          <w:sz w:val="24"/>
-          <w:szCs w:val="24"/>
-        </w:rPr>
-        <w:t xml:space="preserve"> 3 minutos y 46 segundos, este fue el resultado</w:t>
-      </w:r>
-      <w:r>
-        <w:rPr>
-          <w:rFonts w:ascii="Arial" w:hAnsi="Arial" w:cs="Arial"/>
-          <w:sz w:val="24"/>
-          <w:szCs w:val="24"/>
-        </w:rPr>
-        <w:t>:</w:t>
-      </w:r>
-    </w:p>
-    <w:p>
-      <w:pPr>
-        <w:jc w:val="center"/>
-        <w:rPr>
-          <w:rFonts w:ascii="Arial" w:hAnsi="Arial" w:cs="Arial"/>
-          <w:sz w:val="24"/>
-          <w:szCs w:val="24"/>
-        </w:rPr>
-      </w:pPr>
-      <w:r>
-        <w:rPr>
-          <w:rFonts w:ascii="Arial" w:hAnsi="Arial" w:cs="Arial"/>
-          <w:sz w:val="24"/>
-          <w:szCs w:val="24"/>
+      <w:r>
+        <w:rPr>
+          <w:noProof/>
         </w:rPr>
         <w:drawing>
-          <wp:inline distT="0" distB="0" distL="0" distR="0" wp14:anchorId="6BF1F34B" wp14:editId="2A5786DD">
-            <wp:extent cx="4552950" cy="3417631"/>
-            <wp:effectExtent l="0" t="0" r="0" b="0"/>
-            <wp:docPr id="431703266" name="Imagen 2"/>
+          <wp:inline distT="0" distB="0" distL="0" distR="0" wp14:anchorId="067B6C2E" wp14:editId="2D172133">
+            <wp:extent cx="5943600" cy="3345180"/>
+            <wp:effectExtent l="0" t="0" r="0" b="7620"/>
+            <wp:docPr id="906777402" name="Imagen 1"/>
             <wp:cNvGraphicFramePr>
               <a:graphicFrameLocks xmlns:a="http://schemas.openxmlformats.org/drawingml/2006/main" noChangeAspect="1"/>
             </wp:cNvGraphicFramePr>
@@ -1602,7 +1573,7 @@
               <a:graphicData uri="http://schemas.openxmlformats.org/drawingml/2006/picture">
                 <pic:pic xmlns:pic="http://schemas.openxmlformats.org/drawingml/2006/picture">
                   <pic:nvPicPr>
-                    <pic:cNvPr id="0" name="Picture 3"/>
+                    <pic:cNvPr id="0" name="Picture 1"/>
                     <pic:cNvPicPr>
                       <a:picLocks noChangeAspect="1" noChangeArrowheads="1"/>
                     </pic:cNvPicPr>
@@ -1623,7 +1594,217 @@
                   <pic:spPr bwMode="auto">
                     <a:xfrm>
                       <a:off x="0" y="0"/>
+                      <a:ext cx="5943600" cy="3345180"/>
+                    </a:xfrm>
+                    <a:prstGeom prst="rect">
+                      <a:avLst/>
+                    </a:prstGeom>
+                    <a:noFill/>
+                    <a:ln>
+                      <a:noFill/>
+                    </a:ln>
+                  </pic:spPr>
+                </pic:pic>
+              </a:graphicData>
+            </a:graphic>
+          </wp:inline>
+        </w:drawing>
+      </w:r>
+    </w:p>
+    <w:p>
+      <w:pPr>
+        <w:jc w:val="both"/>
+        <w:rPr>
+          <w:rFonts w:ascii="Arial" w:hAnsi="Arial" w:cs="Arial"/>
+          <w:sz w:val="24"/>
+          <w:szCs w:val="24"/>
+        </w:rPr>
+      </w:pPr>
+      <w:r>
+        <w:rPr>
+          <w:rFonts w:ascii="Arial" w:hAnsi="Arial" w:cs="Arial"/>
+          <w:sz w:val="24"/>
+          <w:szCs w:val="24"/>
+        </w:rPr>
+        <w:t xml:space="preserve">El segundo usuario </w:t>
+      </w:r>
+      <w:r>
+        <w:rPr>
+          <w:rFonts w:ascii="Arial" w:hAnsi="Arial" w:cs="Arial"/>
+          <w:sz w:val="24"/>
+          <w:szCs w:val="24"/>
+        </w:rPr>
+        <w:t>realizo la prueba en</w:t>
+      </w:r>
+      <w:r>
+        <w:rPr>
+          <w:rFonts w:ascii="Arial" w:hAnsi="Arial" w:cs="Arial"/>
+          <w:sz w:val="24"/>
+          <w:szCs w:val="24"/>
+        </w:rPr>
+        <w:t xml:space="preserve"> 3 minutos y 46 segundos, este fue el resultado</w:t>
+      </w:r>
+      <w:r>
+        <w:rPr>
+          <w:rFonts w:ascii="Arial" w:hAnsi="Arial" w:cs="Arial"/>
+          <w:sz w:val="24"/>
+          <w:szCs w:val="24"/>
+        </w:rPr>
+        <w:t>:</w:t>
+      </w:r>
+    </w:p>
+    <w:p>
+      <w:pPr>
+        <w:jc w:val="center"/>
+        <w:rPr>
+          <w:rFonts w:ascii="Arial" w:hAnsi="Arial" w:cs="Arial"/>
+          <w:sz w:val="24"/>
+          <w:szCs w:val="24"/>
+        </w:rPr>
+      </w:pPr>
+      <w:r>
+        <w:rPr>
+          <w:rFonts w:ascii="Arial" w:hAnsi="Arial" w:cs="Arial"/>
+          <w:noProof/>
+          <w:sz w:val="24"/>
+          <w:szCs w:val="24"/>
+        </w:rPr>
+        <w:drawing>
+          <wp:inline distT="0" distB="0" distL="0" distR="0" wp14:anchorId="6BF1F34B" wp14:editId="58A3B3B4">
+            <wp:extent cx="4552950" cy="3417631"/>
+            <wp:effectExtent l="0" t="0" r="0" b="0"/>
+            <wp:docPr id="431703266" name="Imagen 2"/>
+            <wp:cNvGraphicFramePr>
+              <a:graphicFrameLocks xmlns:a="http://schemas.openxmlformats.org/drawingml/2006/main" noChangeAspect="1"/>
+            </wp:cNvGraphicFramePr>
+            <a:graphic xmlns:a="http://schemas.openxmlformats.org/drawingml/2006/main">
+              <a:graphicData uri="http://schemas.openxmlformats.org/drawingml/2006/picture">
+                <pic:pic xmlns:pic="http://schemas.openxmlformats.org/drawingml/2006/picture">
+                  <pic:nvPicPr>
+                    <pic:cNvPr id="0" name="Picture 3"/>
+                    <pic:cNvPicPr>
+                      <a:picLocks noChangeAspect="1" noChangeArrowheads="1"/>
+                    </pic:cNvPicPr>
+                  </pic:nvPicPr>
+                  <pic:blipFill>
+                    <a:blip r:embed="rId7" cstate="print">
+                      <a:extLst>
+                        <a:ext uri="{28A0092B-C50C-407E-A947-70E740481C1C}">
+                          <a14:useLocalDpi xmlns:a14="http://schemas.microsoft.com/office/drawing/2010/main" val="0"/>
+                        </a:ext>
+                      </a:extLst>
+                    </a:blip>
+                    <a:srcRect/>
+                    <a:stretch>
+                      <a:fillRect/>
+                    </a:stretch>
+                  </pic:blipFill>
+                  <pic:spPr bwMode="auto">
+                    <a:xfrm>
+                      <a:off x="0" y="0"/>
                       <a:ext cx="4561637" cy="3424152"/>
+                    </a:xfrm>
+                    <a:prstGeom prst="rect">
+                      <a:avLst/>
+                    </a:prstGeom>
+                    <a:noFill/>
+                    <a:ln>
+                      <a:noFill/>
+                    </a:ln>
+                  </pic:spPr>
+                </pic:pic>
+              </a:graphicData>
+            </a:graphic>
+          </wp:inline>
+        </w:drawing>
+      </w:r>
+    </w:p>
+    <w:p>
+      <w:pPr>
+        <w:jc w:val="center"/>
+        <w:rPr>
+          <w:rFonts w:ascii="Arial" w:hAnsi="Arial" w:cs="Arial"/>
+          <w:sz w:val="24"/>
+          <w:szCs w:val="24"/>
+        </w:rPr>
+      </w:pPr>
+    </w:p>
+    <w:p>
+      <w:pPr>
+        <w:jc w:val="center"/>
+        <w:rPr>
+          <w:rFonts w:ascii="Arial" w:hAnsi="Arial" w:cs="Arial"/>
+          <w:sz w:val="24"/>
+          <w:szCs w:val="24"/>
+        </w:rPr>
+      </w:pPr>
+    </w:p>
+    <w:p>
+      <w:pPr>
+        <w:jc w:val="both"/>
+        <w:rPr>
+          <w:rFonts w:ascii="Arial" w:hAnsi="Arial" w:cs="Arial"/>
+          <w:sz w:val="24"/>
+          <w:szCs w:val="24"/>
+        </w:rPr>
+      </w:pPr>
+      <w:r>
+        <w:rPr>
+          <w:rFonts w:ascii="Arial" w:hAnsi="Arial" w:cs="Arial"/>
+          <w:sz w:val="24"/>
+          <w:szCs w:val="24"/>
+        </w:rPr>
+        <w:lastRenderedPageBreak/>
+        <w:t>Mapa de Sitio - Usuario 2:</w:t>
+      </w:r>
+    </w:p>
+    <w:p>
+      <w:pPr>
+        <w:jc w:val="center"/>
+        <w:rPr>
+          <w:rFonts w:ascii="Arial" w:hAnsi="Arial" w:cs="Arial"/>
+          <w:sz w:val="24"/>
+          <w:szCs w:val="24"/>
+        </w:rPr>
+      </w:pPr>
+      <w:r>
+        <w:rPr>
+          <w:noProof/>
+        </w:rPr>
+        <w:drawing>
+          <wp:inline distT="0" distB="0" distL="0" distR="0" wp14:anchorId="47423C0A" wp14:editId="34E76B96">
+            <wp:extent cx="5943600" cy="3345180"/>
+            <wp:effectExtent l="0" t="0" r="0" b="7620"/>
+            <wp:docPr id="747117177" name="Imagen 2"/>
+            <wp:cNvGraphicFramePr>
+              <a:graphicFrameLocks xmlns:a="http://schemas.openxmlformats.org/drawingml/2006/main" noChangeAspect="1"/>
+            </wp:cNvGraphicFramePr>
+            <a:graphic xmlns:a="http://schemas.openxmlformats.org/drawingml/2006/main">
+              <a:graphicData uri="http://schemas.openxmlformats.org/drawingml/2006/picture">
+                <pic:pic xmlns:pic="http://schemas.openxmlformats.org/drawingml/2006/picture">
+                  <pic:nvPicPr>
+                    <pic:cNvPr id="0" name="Picture 3"/>
+                    <pic:cNvPicPr>
+                      <a:picLocks noChangeAspect="1" noChangeArrowheads="1"/>
+                    </pic:cNvPicPr>
+                  </pic:nvPicPr>
+                  <pic:blipFill>
+                    <a:blip r:embed="rId8" cstate="print">
+                      <a:extLst>
+                        <a:ext uri="{28A0092B-C50C-407E-A947-70E740481C1C}">
+                          <a14:useLocalDpi xmlns:a14="http://schemas.microsoft.com/office/drawing/2010/main" val="0"/>
+                        </a:ext>
+                      </a:extLst>
+                    </a:blip>
+                    <a:srcRect/>
+                    <a:stretch>
+                      <a:fillRect/>
+                    </a:stretch>
+                  </pic:blipFill>
+                  <pic:spPr bwMode="auto">
+                    <a:xfrm>
+                      <a:off x="0" y="0"/>
+                      <a:ext cx="5943600" cy="3345180"/>
                     </a:xfrm>
                     <a:prstGeom prst="rect">
                       <a:avLst/>
@@ -3118,6 +3299,7 @@
   <w:style w:type="character" w:default="1" w:styleId="Fuentedeprrafopredeter">
     <w:name w:val="Default Paragraph Font"/>
     <w:uiPriority w:val="1"/>
+    <w:semiHidden/>
     <w:unhideWhenUsed/>
   </w:style>
   <w:style w:type="table" w:default="1" w:styleId="Tablanormal">

</xml_diff>

<commit_message>
refactor docs: correción en la redacción
Se realizó la correción solicitada en el review
</commit_message>
<xml_diff>
--- a/Fase#2/Card Sorting/Card Sorting.docx
+++ b/Fase#2/Card Sorting/Card Sorting.docx
@@ -239,7 +239,23 @@
           <w:sz w:val="24"/>
           <w:szCs w:val="24"/>
         </w:rPr>
-        <w:t>y subcategorías de Tutorías UTDP fueron previamente definidas por el equipo de trabajo con base en la estructura del sistema y su base de datos. De esta manera, los usuarios únicamente debían clasificar las tarjetas dentro de los grupos establecidos, lo que permitió evaluar la claridad y coherencia de la organización propuesta.</w:t>
+        <w:t>y subcategorías de Tutorías UTDP fueron previamente definidas por el equipo de trabajo</w:t>
+      </w:r>
+      <w:r>
+        <w:rPr>
+          <w:rFonts w:ascii="Arial" w:hAnsi="Arial" w:cs="Arial"/>
+          <w:sz w:val="24"/>
+          <w:szCs w:val="24"/>
+        </w:rPr>
+        <w:t xml:space="preserve">. </w:t>
+      </w:r>
+      <w:r>
+        <w:rPr>
+          <w:rFonts w:ascii="Arial" w:hAnsi="Arial" w:cs="Arial"/>
+          <w:sz w:val="24"/>
+          <w:szCs w:val="24"/>
+        </w:rPr>
+        <w:t>De esta manera, los usuarios únicamente debían clasificar las tarjetas dentro de los grupos establecidos, lo que permitió evaluar la claridad y coherencia de la organización propuesta.</w:t>
       </w:r>
     </w:p>
     <w:p>
@@ -813,7 +829,6 @@
           <w:szCs w:val="24"/>
           <w:lang w:val="en-US"/>
         </w:rPr>
-        <w:lastRenderedPageBreak/>
         <w:t>Física</w:t>
       </w:r>
       <w:proofErr w:type="spellEnd"/>
@@ -851,6 +866,7 @@
           <w:szCs w:val="24"/>
           <w:lang w:val="en-US"/>
         </w:rPr>
+        <w:lastRenderedPageBreak/>
         <w:t>Física</w:t>
       </w:r>
       <w:proofErr w:type="spellEnd"/>
@@ -1544,25 +1560,25 @@
           <w:sz w:val="24"/>
           <w:szCs w:val="24"/>
         </w:rPr>
+        <w:t>Mapa de Sitio - Usuario 1:</w:t>
+      </w:r>
+    </w:p>
+    <w:p>
+      <w:pPr>
+        <w:jc w:val="center"/>
+        <w:rPr>
+          <w:rFonts w:ascii="Arial" w:hAnsi="Arial" w:cs="Arial"/>
+          <w:sz w:val="24"/>
+          <w:szCs w:val="24"/>
+        </w:rPr>
+      </w:pPr>
+      <w:r>
+        <w:rPr>
+          <w:noProof/>
+        </w:rPr>
         <w:lastRenderedPageBreak/>
-        <w:t>Mapa de Sitio - Usuario 1:</w:t>
-      </w:r>
-    </w:p>
-    <w:p>
-      <w:pPr>
-        <w:jc w:val="center"/>
-        <w:rPr>
-          <w:rFonts w:ascii="Arial" w:hAnsi="Arial" w:cs="Arial"/>
-          <w:sz w:val="24"/>
-          <w:szCs w:val="24"/>
-        </w:rPr>
-      </w:pPr>
-      <w:r>
-        <w:rPr>
-          <w:noProof/>
-        </w:rPr>
         <w:drawing>
-          <wp:inline distT="0" distB="0" distL="0" distR="0" wp14:anchorId="067B6C2E" wp14:editId="2D172133">
+          <wp:inline distT="0" distB="0" distL="0" distR="0" wp14:anchorId="067B6C2E" wp14:editId="64BDDDC1">
             <wp:extent cx="5943600" cy="3345180"/>
             <wp:effectExtent l="0" t="0" r="0" b="7620"/>
             <wp:docPr id="906777402" name="Imagen 1"/>
@@ -1670,7 +1686,7 @@
           <w:szCs w:val="24"/>
         </w:rPr>
         <w:drawing>
-          <wp:inline distT="0" distB="0" distL="0" distR="0" wp14:anchorId="6BF1F34B" wp14:editId="58A3B3B4">
+          <wp:inline distT="0" distB="0" distL="0" distR="0" wp14:anchorId="6BF1F34B" wp14:editId="53BBBFE7">
             <wp:extent cx="4552950" cy="3417631"/>
             <wp:effectExtent l="0" t="0" r="0" b="0"/>
             <wp:docPr id="431703266" name="Imagen 2"/>
@@ -1754,25 +1770,25 @@
           <w:sz w:val="24"/>
           <w:szCs w:val="24"/>
         </w:rPr>
+        <w:t>Mapa de Sitio - Usuario 2:</w:t>
+      </w:r>
+    </w:p>
+    <w:p>
+      <w:pPr>
+        <w:jc w:val="center"/>
+        <w:rPr>
+          <w:rFonts w:ascii="Arial" w:hAnsi="Arial" w:cs="Arial"/>
+          <w:sz w:val="24"/>
+          <w:szCs w:val="24"/>
+        </w:rPr>
+      </w:pPr>
+      <w:r>
+        <w:rPr>
+          <w:noProof/>
+        </w:rPr>
         <w:lastRenderedPageBreak/>
-        <w:t>Mapa de Sitio - Usuario 2:</w:t>
-      </w:r>
-    </w:p>
-    <w:p>
-      <w:pPr>
-        <w:jc w:val="center"/>
-        <w:rPr>
-          <w:rFonts w:ascii="Arial" w:hAnsi="Arial" w:cs="Arial"/>
-          <w:sz w:val="24"/>
-          <w:szCs w:val="24"/>
-        </w:rPr>
-      </w:pPr>
-      <w:r>
-        <w:rPr>
-          <w:noProof/>
-        </w:rPr>
         <w:drawing>
-          <wp:inline distT="0" distB="0" distL="0" distR="0" wp14:anchorId="47423C0A" wp14:editId="34E76B96">
+          <wp:inline distT="0" distB="0" distL="0" distR="0" wp14:anchorId="47423C0A" wp14:editId="17773869">
             <wp:extent cx="5943600" cy="3345180"/>
             <wp:effectExtent l="0" t="0" r="0" b="7620"/>
             <wp:docPr id="747117177" name="Imagen 2"/>

</xml_diff>